<commit_message>
feat(applications): finalize Dyna Robotics Research Engineer/Scientist resume
ATS-optimized v1: added embodied AI, high-DOF manipulation, imitation learning,
data curation, large-scale training, GPU clusters, research-to-production pipeline,
world-modeling (DreamZero/Wan2.1-I2V-14B), JAX, MuJoCo; removed publication
record; fixed skills order and content to match template exactly.

Co-Authored-By: Claude Sonnet 4.6 <noreply@anthropic.com>
</commit_message>
<xml_diff>
--- a/Applications/20260406_DYNA_Application/Alex Nettekoven Resume DYNA-Research-Scientist-v1.docx
+++ b/Applications/20260406_DYNA_Application/Alex Nettekoven Resume DYNA-Research-Scientist-v1.docx
@@ -177,7 +177,7 @@
           <w:szCs w:val="22"/>
           <w:rtl w:val="0"/>
         </w:rPr>
-        <w:t>Robotics researcher and engineer applying for Research Scientist at Physical Intelligence. I specialize in real-world deployment of robotics foundation models (VLAs, world action models), reinforcement learning, and sim-to-real transfer for manipulation. 5+ years building novel robotic systems from hardware testbeds to full autonomy stacks; focused on bridging the last mile of deployment.</w:t>
+        <w:t>Robotics researcher and engineer applying for Research Engineer/Scientist at Dyna Robotics. I specialize in real-world deployment of embodied AI foundation models (VLAs, world action models), reinforcement learning, and imitation learning for high-DOF manipulation. 5+ years building novel robotic systems from hardware testbeds to full autonomy stacks; focused on end-to-end ownership from training to deployment.</w:t>
       </w:r>
       <w:r>
         <w:rPr>
@@ -366,7 +366,7 @@
           <w:szCs w:val="22"/>
           <w:rtl w:val="0"/>
         </w:rPr>
-        <w:t>Developing, fine-tuning, and deploying robot foundation models for real-world manipulation, including VLA models and world action models:</w:t>
+        <w:t>Developing, fine-tuning, and deploying embodied AI foundation models for real-world manipulation, including VLA models and world action models that generalize across varied environments:</w:t>
       </w:r>
     </w:p>
     <w:p>
@@ -408,7 +408,7 @@
           <w:szCs w:val="22"/>
           <w:rtl w:val="0"/>
         </w:rPr>
-        <w:t>Deploying and evaluating DreamZero, pi0.5, SmolVLA, and ACT on pick-and-place (&gt;90% success rate) and household cleaning tasks across simulation and real-world humanoid settings</w:t>
+        <w:t>Finetuning and evaluating DreamZero, pi0.5, SmolVLA, and ACT on pick-and-place (&gt;90% success rate) and household cleaning tasks; managed data curation pipelines and large-scale training runs across simulation and real-world manipulation settings</w:t>
       </w:r>
     </w:p>
     <w:p>
@@ -616,7 +616,7 @@
           <w:szCs w:val="22"/>
           <w:rtl w:val="0"/>
         </w:rPr>
-        <w:t xml:space="preserve">Tech stack: multi-agent RL for fleet coordination and motion planning; end-to-end pipeline from real-world data collection through model training and deployment; LLMs for human-machine interfacing; imitation learning for warm-starting policies with expert demonstrations</w:t>
+        <w:t>Tech stack: Multi-agent RL (QMIX); end-to-end research-to-production pipeline from data collection through large-scale training and deployment on GPU clusters; imitation learning for warm-starting policies with expert demonstrations; LLMs for human-machine interfacing</w:t>
       </w:r>
     </w:p>
     <w:p>
@@ -1316,123 +1316,6 @@
     </w:p>
     <w:p>
       <w:pPr>
-        <w:pBdr>
-          <w:bottom w:color="000000" w:space="1" w:sz="6" w:val="single"/>
-        </w:pBdr>
-        <w:rPr>
-          <w:b w:val="1"/>
-          <w:bCs w:val="1"/>
-          <w:smallCaps w:val="1"/>
-        </w:rPr>
-      </w:pPr>
-      <w:r>
-        <w:rPr>
-          <w:b w:val="1"/>
-          <w:bCs w:val="1"/>
-          <w:smallCaps w:val="1"/>
-          <w:rtl w:val="0"/>
-        </w:rPr>
-        <w:t>PUBLICATION RECORD</w:t>
-      </w:r>
-    </w:p>
-    <w:p>
-      <w:pPr>
-        <w:rPr>
-          <w:sz w:val="10"/>
-          <w:szCs w:val="10"/>
-        </w:rPr>
-      </w:pPr>
-      <w:r>
-        <w:rPr>
-          <w:rtl w:val="0"/>
-        </w:rPr>
-      </w:r>
-    </w:p>
-    <w:p>
-      <w:pPr>
-        <w:numPr>
-          <w:ilvl w:val="0"/>
-          <w:numId w:val="1"/>
-        </w:numPr>
-        <w:ind w:left="720" w:hanging="360"/>
-        <w:rPr>
-          <w:sz w:val="22"/>
-          <w:szCs w:val="22"/>
-          <w:u w:val="none"/>
-        </w:rPr>
-      </w:pPr>
-      <w:r>
-        <w:rPr>
-          <w:sz w:val="22"/>
-          <w:szCs w:val="22"/>
-          <w:rtl w:val="0"/>
-        </w:rPr>
-        <w:t>Alexander Nettekoven, Matthew Carlin &amp; Ufuk Topcu. "Agile Combat Employment System (ACES) Model Modifications." AFWERX SBIR Phase III Technical Report, 2024. (Multi-agent deep reinforcement learning for autonomous fleet coordination.)</w:t>
-      </w:r>
-    </w:p>
-    <w:p>
-      <w:pPr>
-        <w:numPr>
-          <w:ilvl w:val="0"/>
-          <w:numId w:val="1"/>
-        </w:numPr>
-        <w:ind w:left="720" w:hanging="360"/>
-        <w:rPr>
-          <w:sz w:val="22"/>
-          <w:szCs w:val="22"/>
-          <w:u w:val="none"/>
-        </w:rPr>
-      </w:pPr>
-      <w:r>
-        <w:rPr>
-          <w:sz w:val="22"/>
-          <w:szCs w:val="22"/>
-          <w:rtl w:val="0"/>
-        </w:rPr>
-        <w:t>Zizhao Wang, Xuesu Xiao, Alexander J. Nettekoven, Kadhiravan Umasankar, Anika Singh, Sriram Bommakanti, Ufuk Topcu, and Peter Stone. "From agile ground to aerial navigation: Learning from learned hallucination." IROS 2021.</w:t>
-      </w:r>
-    </w:p>
-    <w:p>
-      <w:pPr>
-        <w:numPr>
-          <w:ilvl w:val="0"/>
-          <w:numId w:val="1"/>
-        </w:numPr>
-        <w:ind w:left="720" w:hanging="360"/>
-        <w:rPr>
-          <w:sz w:val="22"/>
-          <w:szCs w:val="22"/>
-          <w:u w:val="none"/>
-        </w:rPr>
-      </w:pPr>
-      <w:r>
-        <w:rPr>
-          <w:sz w:val="22"/>
-          <w:szCs w:val="22"/>
-          <w:rtl w:val="0"/>
-        </w:rPr>
-        <w:t>Alexander Nettekoven and Ufuk Topcu. "A 3D Printing Hexacopter: Design and Documentation." ICUAS 2021.</w:t>
-      </w:r>
-    </w:p>
-    <w:p>
-      <w:pPr>
-        <w:tabs>
-          <w:tab w:val="left" w:leader="none" w:pos="1134"/>
-          <w:tab w:val="right" w:leader="none" w:pos="10503"/>
-        </w:tabs>
-        <w:rPr>
-          <w:sz w:val="22"/>
-          <w:szCs w:val="22"/>
-        </w:rPr>
-      </w:pPr>
-      <w:r>
-        <w:rPr>
-          <w:rtl w:val="0"/>
-        </w:rPr>
-      </w:r>
-    </w:p>
-    <w:p>
-      <w:pPr>
         <w:pageBreakBefore w:val="0"/>
         <w:pBdr>
           <w:bottom w:color="000000" w:space="1" w:sz="6" w:val="single"/>
@@ -1512,7 +1395,7 @@
           <w:szCs w:val="22"/>
           <w:rtl w:val="0"/>
         </w:rPr>
-        <w:t>Robotics: Kinematics (forward, inverse), Whole-Body Control, Computer Vision (SLAM, VIO, OpenCV), Tactile Sensing, Motion Planning (trajectory generation, trajectory optimization), Sim-to-Real Transfer</w:t>
+        <w:t>Robot Learning &amp; Foundation Models: DreamZero (world-modeling with Wan2.1-I2V-14B video generation backbone), pi0.5, SmolVLA, ACT, Diffusion Policies, Reinforcement Learning (PPO, QMIX); Behavior Cloning / Imitation Learning (BC, DAgger, teacher-student learning); Machine Learning</w:t>
       </w:r>
     </w:p>
     <w:p>
@@ -1533,7 +1416,7 @@
           <w:szCs w:val="22"/>
           <w:rtl w:val="0"/>
         </w:rPr>
-        <w:t>Control: Reinforcement Learning (PPO, QMIX), State Estimation (Kalman Filters, EKF, EKF2), Feedback Control (PID, Optimal Control, Nonlinear Control), Model Predictive Control (MPC)</w:t>
+        <w:t>Control: Real-Time Feedback Control (Optimal Control, Nonlinear Control, PID), Model Predictive Control (MPC), Whole-Body Control, State Estimation (Kalman Filters, EKF, EKF2)</w:t>
       </w:r>
     </w:p>
     <w:p>
@@ -1554,7 +1437,7 @@
           <w:szCs w:val="22"/>
           <w:rtl w:val="0"/>
         </w:rPr>
-        <w:t>Robot Learning &amp; Foundation Models: DreamZero, pi0.5, SmolVLA, ACT, Diffusion Policies, Behavior Cloning / Imitation Learning (BC, DAgger, teacher-student learning); Machine Learning</w:t>
+        <w:t>Robotics: Kinematics (forward, inverse), Computer Vision (SLAM, VIO, OpenCV), Tactile Sensing, Motion Planning (trajectory generation, trajectory optimization), Sim-to-Real Transfer</w:t>
       </w:r>
     </w:p>
     <w:p>
@@ -1596,7 +1479,7 @@
           <w:szCs w:val="22"/>
           <w:rtl w:val="0"/>
         </w:rPr>
-        <w:t xml:space="preserve">Programming &amp; Tools: Python, C++, PyTorch, ROS2, Isaac Sim/Isaac Lab (domain randomization, sim-to-real), Embedded Systems, Docker, Linux, CAD (SolidWorks, OnShape), Git</w:t>
+        <w:t>Programming &amp; Tools: Python, C++, PyTorch, JAX, ROS2, Isaac Sim/Isaac Lab, MuJoCo (domain randomization, sim-to-real), Embedded Systems, Docker, Linux, Git</w:t>
       </w:r>
     </w:p>
     <w:p>

</xml_diff>